<commit_message>
Fix mock exam options: add blank lines between A/B/C/D choices for vertical layout in Word
</commit_message>
<xml_diff>
--- a/ctfl-course-word-docs/mock_exams/mock_exam_1.docx
+++ b/ctfl-course-word-docs/mock_exams/mock_exam_1.docx
@@ -108,21 +108,27 @@
       <w:r>
         <w:t xml:space="preserve">A. To prove the software has no defects</w:t>
       </w:r>
-      <w:r>
-        <w:t xml:space="preserve"> </w:t>
-      </w:r>
+    </w:p>
+    <w:p>
+      <w:pPr>
+        <w:pStyle w:val="BodyText"/>
+      </w:pPr>
       <w:r>
         <w:t xml:space="preserve">B. To find defects, reduce risk, and provide information for stakeholder decisions</w:t>
       </w:r>
-      <w:r>
-        <w:t xml:space="preserve"> </w:t>
-      </w:r>
+    </w:p>
+    <w:p>
+      <w:pPr>
+        <w:pStyle w:val="BodyText"/>
+      </w:pPr>
       <w:r>
         <w:t xml:space="preserve">C. To delay the release until all possible scenarios are tested</w:t>
       </w:r>
-      <w:r>
-        <w:t xml:space="preserve"> </w:t>
-      </w:r>
+    </w:p>
+    <w:p>
+      <w:pPr>
+        <w:pStyle w:val="BodyText"/>
+      </w:pPr>
       <w:r>
         <w:t xml:space="preserve">D. To replace the need for requirements reviews</w:t>
       </w:r>
@@ -176,21 +182,27 @@
       <w:r>
         <w:t xml:space="preserve">A. A failure</w:t>
       </w:r>
-      <w:r>
-        <w:t xml:space="preserve"> </w:t>
-      </w:r>
+    </w:p>
+    <w:p>
+      <w:pPr>
+        <w:pStyle w:val="BodyText"/>
+      </w:pPr>
       <w:r>
         <w:t xml:space="preserve">B. A defect</w:t>
       </w:r>
-      <w:r>
-        <w:t xml:space="preserve"> </w:t>
-      </w:r>
+    </w:p>
+    <w:p>
+      <w:pPr>
+        <w:pStyle w:val="BodyText"/>
+      </w:pPr>
       <w:r>
         <w:t xml:space="preserve">C. An error</w:t>
       </w:r>
-      <w:r>
-        <w:t xml:space="preserve"> </w:t>
-      </w:r>
+    </w:p>
+    <w:p>
+      <w:pPr>
+        <w:pStyle w:val="BodyText"/>
+      </w:pPr>
       <w:r>
         <w:t xml:space="preserve">D. A root cause</w:t>
       </w:r>
@@ -220,21 +232,27 @@
       <w:r>
         <w:t xml:space="preserve">A. Exhaustive testing is impossible</w:t>
       </w:r>
-      <w:r>
-        <w:t xml:space="preserve"> </w:t>
-      </w:r>
+    </w:p>
+    <w:p>
+      <w:pPr>
+        <w:pStyle w:val="BodyText"/>
+      </w:pPr>
       <w:r>
         <w:t xml:space="preserve">B. Testing shows the presence of defects</w:t>
       </w:r>
-      <w:r>
-        <w:t xml:space="preserve"> </w:t>
-      </w:r>
+    </w:p>
+    <w:p>
+      <w:pPr>
+        <w:pStyle w:val="BodyText"/>
+      </w:pPr>
       <w:r>
         <w:t xml:space="preserve">C. Defects cluster together</w:t>
       </w:r>
-      <w:r>
-        <w:t xml:space="preserve"> </w:t>
-      </w:r>
+    </w:p>
+    <w:p>
+      <w:pPr>
+        <w:pStyle w:val="BodyText"/>
+      </w:pPr>
       <w:r>
         <w:t xml:space="preserve">D. Pesticide paradox</w:t>
       </w:r>
@@ -264,21 +282,27 @@
       <w:r>
         <w:t xml:space="preserve">A. Test planning</w:t>
       </w:r>
-      <w:r>
-        <w:t xml:space="preserve"> </w:t>
-      </w:r>
+    </w:p>
+    <w:p>
+      <w:pPr>
+        <w:pStyle w:val="BodyText"/>
+      </w:pPr>
       <w:r>
         <w:t xml:space="preserve">B. Test analysis</w:t>
       </w:r>
-      <w:r>
-        <w:t xml:space="preserve"> </w:t>
-      </w:r>
+    </w:p>
+    <w:p>
+      <w:pPr>
+        <w:pStyle w:val="BodyText"/>
+      </w:pPr>
       <w:r>
         <w:t xml:space="preserve">C. Test design</w:t>
       </w:r>
-      <w:r>
-        <w:t xml:space="preserve"> </w:t>
-      </w:r>
+    </w:p>
+    <w:p>
+      <w:pPr>
+        <w:pStyle w:val="BodyText"/>
+      </w:pPr>
       <w:r>
         <w:t xml:space="preserve">D. Test execution</w:t>
       </w:r>
@@ -308,21 +332,27 @@
       <w:r>
         <w:t xml:space="preserve">A. Only the dedicated testers</w:t>
       </w:r>
-      <w:r>
-        <w:t xml:space="preserve"> </w:t>
-      </w:r>
+    </w:p>
+    <w:p>
+      <w:pPr>
+        <w:pStyle w:val="BodyText"/>
+      </w:pPr>
       <w:r>
         <w:t xml:space="preserve">B. Only the test manager</w:t>
       </w:r>
-      <w:r>
-        <w:t xml:space="preserve"> </w:t>
-      </w:r>
+    </w:p>
+    <w:p>
+      <w:pPr>
+        <w:pStyle w:val="BodyText"/>
+      </w:pPr>
       <w:r>
         <w:t xml:space="preserve">C. Every team member</w:t>
       </w:r>
-      <w:r>
-        <w:t xml:space="preserve"> </w:t>
-      </w:r>
+    </w:p>
+    <w:p>
+      <w:pPr>
+        <w:pStyle w:val="BodyText"/>
+      </w:pPr>
       <w:r>
         <w:t xml:space="preserve">D. Only the product owner</w:t>
       </w:r>
@@ -352,21 +382,27 @@
       <w:r>
         <w:t xml:space="preserve">A. There is no difference; they are the same</w:t>
       </w:r>
-      <w:r>
-        <w:t xml:space="preserve"> </w:t>
-      </w:r>
+    </w:p>
+    <w:p>
+      <w:pPr>
+        <w:pStyle w:val="BodyText"/>
+      </w:pPr>
       <w:r>
         <w:t xml:space="preserve">B. The management role plans and controls testing; the testing role analyzes, designs, and executes tests</w:t>
       </w:r>
-      <w:r>
-        <w:t xml:space="preserve"> </w:t>
-      </w:r>
+    </w:p>
+    <w:p>
+      <w:pPr>
+        <w:pStyle w:val="BodyText"/>
+      </w:pPr>
       <w:r>
         <w:t xml:space="preserve">C. The testing role writes the test plan; the management role executes tests</w:t>
       </w:r>
-      <w:r>
-        <w:t xml:space="preserve"> </w:t>
-      </w:r>
+    </w:p>
+    <w:p>
+      <w:pPr>
+        <w:pStyle w:val="BodyText"/>
+      </w:pPr>
       <w:r>
         <w:t xml:space="preserve">D. The management role only exists in Agile projects</w:t>
       </w:r>
@@ -396,21 +432,27 @@
       <w:r>
         <w:t xml:space="preserve">A. Component testing</w:t>
       </w:r>
-      <w:r>
-        <w:t xml:space="preserve"> </w:t>
-      </w:r>
+    </w:p>
+    <w:p>
+      <w:pPr>
+        <w:pStyle w:val="BodyText"/>
+      </w:pPr>
       <w:r>
         <w:t xml:space="preserve">B. Integration testing</w:t>
       </w:r>
-      <w:r>
-        <w:t xml:space="preserve"> </w:t>
-      </w:r>
+    </w:p>
+    <w:p>
+      <w:pPr>
+        <w:pStyle w:val="BodyText"/>
+      </w:pPr>
       <w:r>
         <w:t xml:space="preserve">C. System testing</w:t>
       </w:r>
-      <w:r>
-        <w:t xml:space="preserve"> </w:t>
-      </w:r>
+    </w:p>
+    <w:p>
+      <w:pPr>
+        <w:pStyle w:val="BodyText"/>
+      </w:pPr>
       <w:r>
         <w:t xml:space="preserve">D. Acceptance testing</w:t>
       </w:r>
@@ -440,21 +482,27 @@
       <w:r>
         <w:t xml:space="preserve">A. Moving test execution to the end of the project</w:t>
       </w:r>
-      <w:r>
-        <w:t xml:space="preserve"> </w:t>
-      </w:r>
+    </w:p>
+    <w:p>
+      <w:pPr>
+        <w:pStyle w:val="BodyText"/>
+      </w:pPr>
       <w:r>
         <w:t xml:space="preserve">B. Performing testing activities earlier in the lifecycle to find defects sooner</w:t>
       </w:r>
-      <w:r>
-        <w:t xml:space="preserve"> </w:t>
-      </w:r>
+    </w:p>
+    <w:p>
+      <w:pPr>
+        <w:pStyle w:val="BodyText"/>
+      </w:pPr>
       <w:r>
         <w:t xml:space="preserve">C. Replacing developers with testers</w:t>
       </w:r>
-      <w:r>
-        <w:t xml:space="preserve"> </w:t>
-      </w:r>
+    </w:p>
+    <w:p>
+      <w:pPr>
+        <w:pStyle w:val="BodyText"/>
+      </w:pPr>
       <w:r>
         <w:t xml:space="preserve">D. Automating all tests before any code is written</w:t>
       </w:r>
@@ -484,21 +532,27 @@
       <w:r>
         <w:t xml:space="preserve">A. TDD operates at the unit/component level driven by developers; ATDD operates at the system/acceptance level with collaboration among business, developer, and tester</w:t>
       </w:r>
-      <w:r>
-        <w:t xml:space="preserve"> </w:t>
-      </w:r>
+    </w:p>
+    <w:p>
+      <w:pPr>
+        <w:pStyle w:val="BodyText"/>
+      </w:pPr>
       <w:r>
         <w:t xml:space="preserve">B. TDD is manual; ATDD is automated</w:t>
       </w:r>
-      <w:r>
-        <w:t xml:space="preserve"> </w:t>
-      </w:r>
+    </w:p>
+    <w:p>
+      <w:pPr>
+        <w:pStyle w:val="BodyText"/>
+      </w:pPr>
       <w:r>
         <w:t xml:space="preserve">C. TDD uses natural language; ATDD uses code</w:t>
       </w:r>
-      <w:r>
-        <w:t xml:space="preserve"> </w:t>
-      </w:r>
+    </w:p>
+    <w:p>
+      <w:pPr>
+        <w:pStyle w:val="BodyText"/>
+      </w:pPr>
       <w:r>
         <w:t xml:space="preserve">D. They are the same approach with different names</w:t>
       </w:r>
@@ -528,21 +582,27 @@
       <w:r>
         <w:t xml:space="preserve">A. Regression testing</w:t>
       </w:r>
-      <w:r>
-        <w:t xml:space="preserve"> </w:t>
-      </w:r>
+    </w:p>
+    <w:p>
+      <w:pPr>
+        <w:pStyle w:val="BodyText"/>
+      </w:pPr>
       <w:r>
         <w:t xml:space="preserve">B. Confirmation testing</w:t>
       </w:r>
-      <w:r>
-        <w:t xml:space="preserve"> </w:t>
-      </w:r>
+    </w:p>
+    <w:p>
+      <w:pPr>
+        <w:pStyle w:val="BodyText"/>
+      </w:pPr>
       <w:r>
         <w:t xml:space="preserve">C. Smoke testing</w:t>
       </w:r>
-      <w:r>
-        <w:t xml:space="preserve"> </w:t>
-      </w:r>
+    </w:p>
+    <w:p>
+      <w:pPr>
+        <w:pStyle w:val="BodyText"/>
+      </w:pPr>
       <w:r>
         <w:t xml:space="preserve">D. Exploratory testing</w:t>
       </w:r>
@@ -572,21 +632,27 @@
       <w:r>
         <w:t xml:space="preserve">A. Initial development of a new system</w:t>
       </w:r>
-      <w:r>
-        <w:t xml:space="preserve"> </w:t>
-      </w:r>
+    </w:p>
+    <w:p>
+      <w:pPr>
+        <w:pStyle w:val="BodyText"/>
+      </w:pPr>
       <w:r>
         <w:t xml:space="preserve">B. Migration of a system from on-premise to the cloud</w:t>
       </w:r>
-      <w:r>
-        <w:t xml:space="preserve"> </w:t>
-      </w:r>
+    </w:p>
+    <w:p>
+      <w:pPr>
+        <w:pStyle w:val="BodyText"/>
+      </w:pPr>
       <w:r>
         <w:t xml:space="preserve">C. Creation of unit tests during TDD</w:t>
       </w:r>
-      <w:r>
-        <w:t xml:space="preserve"> </w:t>
-      </w:r>
+    </w:p>
+    <w:p>
+      <w:pPr>
+        <w:pStyle w:val="BodyText"/>
+      </w:pPr>
       <w:r>
         <w:t xml:space="preserve">D. Planning a sprint backlog</w:t>
       </w:r>
@@ -616,21 +682,27 @@
       <w:r>
         <w:t xml:space="preserve">A. Only source code</w:t>
       </w:r>
-      <w:r>
-        <w:t xml:space="preserve"> </w:t>
-      </w:r>
+    </w:p>
+    <w:p>
+      <w:pPr>
+        <w:pStyle w:val="BodyText"/>
+      </w:pPr>
       <w:r>
         <w:t xml:space="preserve">B. Only requirements documents</w:t>
       </w:r>
-      <w:r>
-        <w:t xml:space="preserve"> </w:t>
-      </w:r>
+    </w:p>
+    <w:p>
+      <w:pPr>
+        <w:pStyle w:val="BodyText"/>
+      </w:pPr>
       <w:r>
         <w:t xml:space="preserve">C. Any readable work product including requirements, designs, code, test plans, and manuals</w:t>
       </w:r>
-      <w:r>
-        <w:t xml:space="preserve"> </w:t>
-      </w:r>
+    </w:p>
+    <w:p>
+      <w:pPr>
+        <w:pStyle w:val="BodyText"/>
+      </w:pPr>
       <w:r>
         <w:t xml:space="preserve">D. Only work products that can be executed</w:t>
       </w:r>
@@ -660,21 +732,27 @@
       <w:r>
         <w:t xml:space="preserve">A. Planning</w:t>
       </w:r>
-      <w:r>
-        <w:t xml:space="preserve"> </w:t>
-      </w:r>
+    </w:p>
+    <w:p>
+      <w:pPr>
+        <w:pStyle w:val="BodyText"/>
+      </w:pPr>
       <w:r>
         <w:t xml:space="preserve">B. Individual review (preparation)</w:t>
       </w:r>
-      <w:r>
-        <w:t xml:space="preserve"> </w:t>
-      </w:r>
+    </w:p>
+    <w:p>
+      <w:pPr>
+        <w:pStyle w:val="BodyText"/>
+      </w:pPr>
       <w:r>
         <w:t xml:space="preserve">C. The review meeting</w:t>
       </w:r>
-      <w:r>
-        <w:t xml:space="preserve"> </w:t>
-      </w:r>
+    </w:p>
+    <w:p>
+      <w:pPr>
+        <w:pStyle w:val="BodyText"/>
+      </w:pPr>
       <w:r>
         <w:t xml:space="preserve">D. Fixing and reporting</w:t>
       </w:r>
@@ -704,21 +782,27 @@
       <w:r>
         <w:t xml:space="preserve">A. Inspection</w:t>
       </w:r>
-      <w:r>
-        <w:t xml:space="preserve"> </w:t>
-      </w:r>
+    </w:p>
+    <w:p>
+      <w:pPr>
+        <w:pStyle w:val="BodyText"/>
+      </w:pPr>
       <w:r>
         <w:t xml:space="preserve">B. Walkthrough</w:t>
       </w:r>
-      <w:r>
-        <w:t xml:space="preserve"> </w:t>
-      </w:r>
+    </w:p>
+    <w:p>
+      <w:pPr>
+        <w:pStyle w:val="BodyText"/>
+      </w:pPr>
       <w:r>
         <w:t xml:space="preserve">C. Technical review</w:t>
       </w:r>
-      <w:r>
-        <w:t xml:space="preserve"> </w:t>
-      </w:r>
+    </w:p>
+    <w:p>
+      <w:pPr>
+        <w:pStyle w:val="BodyText"/>
+      </w:pPr>
       <w:r>
         <w:t xml:space="preserve">D. Informal review</w:t>
       </w:r>
@@ -748,21 +832,27 @@
       <w:r>
         <w:t xml:space="preserve">A. Informal review</w:t>
       </w:r>
-      <w:r>
-        <w:t xml:space="preserve"> </w:t>
-      </w:r>
+    </w:p>
+    <w:p>
+      <w:pPr>
+        <w:pStyle w:val="BodyText"/>
+      </w:pPr>
       <w:r>
         <w:t xml:space="preserve">B. Walkthrough</w:t>
       </w:r>
-      <w:r>
-        <w:t xml:space="preserve"> </w:t>
-      </w:r>
+    </w:p>
+    <w:p>
+      <w:pPr>
+        <w:pStyle w:val="BodyText"/>
+      </w:pPr>
       <w:r>
         <w:t xml:space="preserve">C. Technical review</w:t>
       </w:r>
-      <w:r>
-        <w:t xml:space="preserve"> </w:t>
-      </w:r>
+    </w:p>
+    <w:p>
+      <w:pPr>
+        <w:pStyle w:val="BodyText"/>
+      </w:pPr>
       <w:r>
         <w:t xml:space="preserve">D. Inspection</w:t>
       </w:r>
@@ -792,21 +882,27 @@
       <w:r>
         <w:t xml:space="preserve">A. 1 (the valid range only)</w:t>
       </w:r>
-      <w:r>
-        <w:t xml:space="preserve"> </w:t>
-      </w:r>
+    </w:p>
+    <w:p>
+      <w:pPr>
+        <w:pStyle w:val="BodyText"/>
+      </w:pPr>
       <w:r>
         <w:t xml:space="preserve">B. 2 (valid and one invalid)</w:t>
       </w:r>
-      <w:r>
-        <w:t xml:space="preserve"> </w:t>
-      </w:r>
+    </w:p>
+    <w:p>
+      <w:pPr>
+        <w:pStyle w:val="BodyText"/>
+      </w:pPr>
       <w:r>
         <w:t xml:space="preserve">C. 3 (below range, within range, above range)</w:t>
       </w:r>
-      <w:r>
-        <w:t xml:space="preserve"> </w:t>
-      </w:r>
+    </w:p>
+    <w:p>
+      <w:pPr>
+        <w:pStyle w:val="BodyText"/>
+      </w:pPr>
       <w:r>
         <w:t xml:space="preserve">D. 5 (below, within, above, non-integer, non-numeric)</w:t>
       </w:r>
@@ -836,21 +932,27 @@
       <w:r>
         <w:t xml:space="preserve">A. 0, 1, 100, 101</w:t>
       </w:r>
-      <w:r>
-        <w:t xml:space="preserve"> </w:t>
-      </w:r>
+    </w:p>
+    <w:p>
+      <w:pPr>
+        <w:pStyle w:val="BodyText"/>
+      </w:pPr>
       <w:r>
         <w:t xml:space="preserve">B. 1, 50, 100</w:t>
       </w:r>
-      <w:r>
-        <w:t xml:space="preserve"> </w:t>
-      </w:r>
+    </w:p>
+    <w:p>
+      <w:pPr>
+        <w:pStyle w:val="BodyText"/>
+      </w:pPr>
       <w:r>
         <w:t xml:space="preserve">C. -1, 0, 1, 2, 99, 100, 101, 102</w:t>
       </w:r>
-      <w:r>
-        <w:t xml:space="preserve"> </w:t>
-      </w:r>
+    </w:p>
+    <w:p>
+      <w:pPr>
+        <w:pStyle w:val="BodyText"/>
+      </w:pPr>
       <w:r>
         <w:t xml:space="preserve">D. 1, 100</w:t>
       </w:r>
@@ -880,21 +982,27 @@
       <w:r>
         <w:t xml:space="preserve">A. 3</w:t>
       </w:r>
-      <w:r>
-        <w:t xml:space="preserve"> </w:t>
-      </w:r>
+    </w:p>
+    <w:p>
+      <w:pPr>
+        <w:pStyle w:val="BodyText"/>
+      </w:pPr>
       <w:r>
         <w:t xml:space="preserve">B. 6</w:t>
       </w:r>
-      <w:r>
-        <w:t xml:space="preserve"> </w:t>
-      </w:r>
+    </w:p>
+    <w:p>
+      <w:pPr>
+        <w:pStyle w:val="BodyText"/>
+      </w:pPr>
       <w:r>
         <w:t xml:space="preserve">C. 8</w:t>
       </w:r>
-      <w:r>
-        <w:t xml:space="preserve"> </w:t>
-      </w:r>
+    </w:p>
+    <w:p>
+      <w:pPr>
+        <w:pStyle w:val="BodyText"/>
+      </w:pPr>
       <w:r>
         <w:t xml:space="preserve">D. 9</w:t>
       </w:r>
@@ -924,21 +1032,27 @@
       <w:r>
         <w:t xml:space="preserve">A. 4</w:t>
       </w:r>
-      <w:r>
-        <w:t xml:space="preserve"> </w:t>
-      </w:r>
+    </w:p>
+    <w:p>
+      <w:pPr>
+        <w:pStyle w:val="BodyText"/>
+      </w:pPr>
       <w:r>
         <w:t xml:space="preserve">B. 7</w:t>
       </w:r>
-      <w:r>
-        <w:t xml:space="preserve"> </w:t>
-      </w:r>
+    </w:p>
+    <w:p>
+      <w:pPr>
+        <w:pStyle w:val="BodyText"/>
+      </w:pPr>
       <w:r>
         <w:t xml:space="preserve">C. It depends on how transitions can be combined into paths (typically less than 7)</w:t>
       </w:r>
-      <w:r>
-        <w:t xml:space="preserve"> </w:t>
-      </w:r>
+    </w:p>
+    <w:p>
+      <w:pPr>
+        <w:pStyle w:val="BodyText"/>
+      </w:pPr>
       <w:r>
         <w:t xml:space="preserve">D. 1</w:t>
       </w:r>
@@ -1032,21 +1146,27 @@
       <w:r>
         <w:t xml:space="preserve">A. 2</w:t>
       </w:r>
-      <w:r>
-        <w:t xml:space="preserve"> </w:t>
-      </w:r>
+    </w:p>
+    <w:p>
+      <w:pPr>
+        <w:pStyle w:val="BodyText"/>
+      </w:pPr>
       <w:r>
         <w:t xml:space="preserve">B. 4</w:t>
       </w:r>
-      <w:r>
-        <w:t xml:space="preserve"> </w:t>
-      </w:r>
+    </w:p>
+    <w:p>
+      <w:pPr>
+        <w:pStyle w:val="BodyText"/>
+      </w:pPr>
       <w:r>
         <w:t xml:space="preserve">C. 6</w:t>
       </w:r>
-      <w:r>
-        <w:t xml:space="preserve"> </w:t>
-      </w:r>
+    </w:p>
+    <w:p>
+      <w:pPr>
+        <w:pStyle w:val="BodyText"/>
+      </w:pPr>
       <w:r>
         <w:t xml:space="preserve">D. 8</w:t>
       </w:r>
@@ -1076,21 +1196,27 @@
       <w:r>
         <w:t xml:space="preserve">A. Yes, statement coverage always implies branch coverage</w:t>
       </w:r>
-      <w:r>
-        <w:t xml:space="preserve"> </w:t>
-      </w:r>
+    </w:p>
+    <w:p>
+      <w:pPr>
+        <w:pStyle w:val="BodyText"/>
+      </w:pPr>
       <w:r>
         <w:t xml:space="preserve">B. No, 100% statement coverage does not guarantee 100% branch coverage</w:t>
       </w:r>
-      <w:r>
-        <w:t xml:space="preserve"> </w:t>
-      </w:r>
+    </w:p>
+    <w:p>
+      <w:pPr>
+        <w:pStyle w:val="BodyText"/>
+      </w:pPr>
       <w:r>
         <w:t xml:space="preserve">C. Yes, they are the same measurement</w:t>
       </w:r>
-      <w:r>
-        <w:t xml:space="preserve"> </w:t>
-      </w:r>
+    </w:p>
+    <w:p>
+      <w:pPr>
+        <w:pStyle w:val="BodyText"/>
+      </w:pPr>
       <w:r>
         <w:t xml:space="preserve">D. No, branch coverage always implies statement coverage (this answer is about the reverse)</w:t>
       </w:r>
@@ -1120,21 +1246,27 @@
       <w:r>
         <w:t xml:space="preserve">A. Equivalence partitioning</w:t>
       </w:r>
-      <w:r>
-        <w:t xml:space="preserve"> </w:t>
-      </w:r>
+    </w:p>
+    <w:p>
+      <w:pPr>
+        <w:pStyle w:val="BodyText"/>
+      </w:pPr>
       <w:r>
         <w:t xml:space="preserve">B. Decision table testing</w:t>
       </w:r>
-      <w:r>
-        <w:t xml:space="preserve"> </w:t>
-      </w:r>
+    </w:p>
+    <w:p>
+      <w:pPr>
+        <w:pStyle w:val="BodyText"/>
+      </w:pPr>
       <w:r>
         <w:t xml:space="preserve">C. Error guessing</w:t>
       </w:r>
-      <w:r>
-        <w:t xml:space="preserve"> </w:t>
-      </w:r>
+    </w:p>
+    <w:p>
+      <w:pPr>
+        <w:pStyle w:val="BodyText"/>
+      </w:pPr>
       <w:r>
         <w:t xml:space="preserve">D. State transition testing</w:t>
       </w:r>
@@ -1164,21 +1296,27 @@
       <w:r>
         <w:t xml:space="preserve">A. It is completely unstructured with no planning</w:t>
       </w:r>
-      <w:r>
-        <w:t xml:space="preserve"> </w:t>
-      </w:r>
+    </w:p>
+    <w:p>
+      <w:pPr>
+        <w:pStyle w:val="BodyText"/>
+      </w:pPr>
       <w:r>
         <w:t xml:space="preserve">B. It uses test charters and time-boxes to provide structure while allowing the tester to adapt dynamically</w:t>
       </w:r>
-      <w:r>
-        <w:t xml:space="preserve"> </w:t>
-      </w:r>
+    </w:p>
+    <w:p>
+      <w:pPr>
+        <w:pStyle w:val="BodyText"/>
+      </w:pPr>
       <w:r>
         <w:t xml:space="preserve">C. It can only be performed by junior testers</w:t>
       </w:r>
-      <w:r>
-        <w:t xml:space="preserve"> </w:t>
-      </w:r>
+    </w:p>
+    <w:p>
+      <w:pPr>
+        <w:pStyle w:val="BodyText"/>
+      </w:pPr>
       <w:r>
         <w:t xml:space="preserve">D. It produces no documentation</w:t>
       </w:r>
@@ -1220,21 +1358,27 @@
       <w:r>
         <w:t xml:space="preserve">A. Three customers</w:t>
       </w:r>
-      <w:r>
-        <w:t xml:space="preserve"> </w:t>
-      </w:r>
+    </w:p>
+    <w:p>
+      <w:pPr>
+        <w:pStyle w:val="BodyText"/>
+      </w:pPr>
       <w:r>
         <w:t xml:space="preserve">B. Business representative, developer, and tester</w:t>
       </w:r>
-      <w:r>
-        <w:t xml:space="preserve"> </w:t>
-      </w:r>
+    </w:p>
+    <w:p>
+      <w:pPr>
+        <w:pStyle w:val="BodyText"/>
+      </w:pPr>
       <w:r>
         <w:t xml:space="preserve">C. Project manager, Scrum master, and architect</w:t>
       </w:r>
-      <w:r>
-        <w:t xml:space="preserve"> </w:t>
-      </w:r>
+    </w:p>
+    <w:p>
+      <w:pPr>
+        <w:pStyle w:val="BodyText"/>
+      </w:pPr>
       <w:r>
         <w:t xml:space="preserve">D. Three different testers</w:t>
       </w:r>
@@ -1264,21 +1408,27 @@
       <w:r>
         <w:t xml:space="preserve">A. After development is complete</w:t>
       </w:r>
-      <w:r>
-        <w:t xml:space="preserve"> </w:t>
-      </w:r>
+    </w:p>
+    <w:p>
+      <w:pPr>
+        <w:pStyle w:val="BodyText"/>
+      </w:pPr>
       <w:r>
         <w:t xml:space="preserve">B. During system testing</w:t>
       </w:r>
-      <w:r>
-        <w:t xml:space="preserve"> </w:t>
-      </w:r>
+    </w:p>
+    <w:p>
+      <w:pPr>
+        <w:pStyle w:val="BodyText"/>
+      </w:pPr>
       <w:r>
         <w:t xml:space="preserve">C. Before development begins, based on acceptance criteria</w:t>
       </w:r>
-      <w:r>
-        <w:t xml:space="preserve"> </w:t>
-      </w:r>
+    </w:p>
+    <w:p>
+      <w:pPr>
+        <w:pStyle w:val="BodyText"/>
+      </w:pPr>
       <w:r>
         <w:t xml:space="preserve">D. Only after production defects are found</w:t>
       </w:r>
@@ -1308,21 +1458,27 @@
       <w:r>
         <w:t xml:space="preserve">A. To list all defects found</w:t>
       </w:r>
-      <w:r>
-        <w:t xml:space="preserve"> </w:t>
-      </w:r>
+    </w:p>
+    <w:p>
+      <w:pPr>
+        <w:pStyle w:val="BodyText"/>
+      </w:pPr>
       <w:r>
         <w:t xml:space="preserve">B. To document the test objectives, approach, scope, schedule, resources, and criteria for the testing effort</w:t>
       </w:r>
-      <w:r>
-        <w:t xml:space="preserve"> </w:t>
-      </w:r>
+    </w:p>
+    <w:p>
+      <w:pPr>
+        <w:pStyle w:val="BodyText"/>
+      </w:pPr>
       <w:r>
         <w:t xml:space="preserve">C. To provide the final quality assessment</w:t>
       </w:r>
-      <w:r>
-        <w:t xml:space="preserve"> </w:t>
-      </w:r>
+    </w:p>
+    <w:p>
+      <w:pPr>
+        <w:pStyle w:val="BodyText"/>
+      </w:pPr>
       <w:r>
         <w:t xml:space="preserve">D. To replace communication between team members</w:t>
       </w:r>
@@ -1352,21 +1508,27 @@
       <w:r>
         <w:t xml:space="preserve">A. Entry criteria</w:t>
       </w:r>
-      <w:r>
-        <w:t xml:space="preserve"> </w:t>
-      </w:r>
+    </w:p>
+    <w:p>
+      <w:pPr>
+        <w:pStyle w:val="BodyText"/>
+      </w:pPr>
       <w:r>
         <w:t xml:space="preserve">B. Exit criteria</w:t>
       </w:r>
-      <w:r>
-        <w:t xml:space="preserve"> </w:t>
-      </w:r>
+    </w:p>
+    <w:p>
+      <w:pPr>
+        <w:pStyle w:val="BodyText"/>
+      </w:pPr>
       <w:r>
         <w:t xml:space="preserve">C. Test charter</w:t>
       </w:r>
-      <w:r>
-        <w:t xml:space="preserve"> </w:t>
-      </w:r>
+    </w:p>
+    <w:p>
+      <w:pPr>
+        <w:pStyle w:val="BodyText"/>
+      </w:pPr>
       <w:r>
         <w:t xml:space="preserve">D. Defect report</w:t>
       </w:r>
@@ -1396,21 +1558,27 @@
       <w:r>
         <w:t xml:space="preserve">A. A metrics-based technique</w:t>
       </w:r>
-      <w:r>
-        <w:t xml:space="preserve"> </w:t>
-      </w:r>
+    </w:p>
+    <w:p>
+      <w:pPr>
+        <w:pStyle w:val="BodyText"/>
+      </w:pPr>
       <w:r>
         <w:t xml:space="preserve">B. An expert-based technique</w:t>
       </w:r>
-      <w:r>
-        <w:t xml:space="preserve"> </w:t>
-      </w:r>
+    </w:p>
+    <w:p>
+      <w:pPr>
+        <w:pStyle w:val="BodyText"/>
+      </w:pPr>
       <w:r>
         <w:t xml:space="preserve">C. A risk-based technique</w:t>
       </w:r>
-      <w:r>
-        <w:t xml:space="preserve"> </w:t>
-      </w:r>
+    </w:p>
+    <w:p>
+      <w:pPr>
+        <w:pStyle w:val="BodyText"/>
+      </w:pPr>
       <w:r>
         <w:t xml:space="preserve">D. A coverage-based technique</w:t>
       </w:r>
@@ -1440,21 +1608,27 @@
       <w:r>
         <w:t xml:space="preserve">A. Unit/component tests</w:t>
       </w:r>
-      <w:r>
-        <w:t xml:space="preserve"> </w:t>
-      </w:r>
+    </w:p>
+    <w:p>
+      <w:pPr>
+        <w:pStyle w:val="BodyText"/>
+      </w:pPr>
       <w:r>
         <w:t xml:space="preserve">B. Integration/API tests</w:t>
       </w:r>
-      <w:r>
-        <w:t xml:space="preserve"> </w:t>
-      </w:r>
+    </w:p>
+    <w:p>
+      <w:pPr>
+        <w:pStyle w:val="BodyText"/>
+      </w:pPr>
       <w:r>
         <w:t xml:space="preserve">C. UI/end-to-end tests</w:t>
       </w:r>
-      <w:r>
-        <w:t xml:space="preserve"> </w:t>
-      </w:r>
+    </w:p>
+    <w:p>
+      <w:pPr>
+        <w:pStyle w:val="BodyText"/>
+      </w:pPr>
       <w:r>
         <w:t xml:space="preserve">D. All layers should have equal numbers</w:t>
       </w:r>
@@ -1484,21 +1658,27 @@
       <w:r>
         <w:t xml:space="preserve">A. The first risk (2 x 5 = 10)</w:t>
       </w:r>
-      <w:r>
-        <w:t xml:space="preserve"> </w:t>
-      </w:r>
+    </w:p>
+    <w:p>
+      <w:pPr>
+        <w:pStyle w:val="BodyText"/>
+      </w:pPr>
       <w:r>
         <w:t xml:space="preserve">B. The second risk (4 x 2 = 8)</w:t>
       </w:r>
-      <w:r>
-        <w:t xml:space="preserve"> </w:t>
-      </w:r>
+    </w:p>
+    <w:p>
+      <w:pPr>
+        <w:pStyle w:val="BodyText"/>
+      </w:pPr>
       <w:r>
         <w:t xml:space="preserve">C. They are equal</w:t>
       </w:r>
-      <w:r>
-        <w:t xml:space="preserve"> </w:t>
-      </w:r>
+    </w:p>
+    <w:p>
+      <w:pPr>
+        <w:pStyle w:val="BodyText"/>
+      </w:pPr>
       <w:r>
         <w:t xml:space="preserve">D. Cannot be determined</w:t>
       </w:r>
@@ -1528,21 +1708,27 @@
       <w:r>
         <w:t xml:space="preserve">A. Test environment unavailability</w:t>
       </w:r>
-      <w:r>
-        <w:t xml:space="preserve"> </w:t>
-      </w:r>
+    </w:p>
+    <w:p>
+      <w:pPr>
+        <w:pStyle w:val="BodyText"/>
+      </w:pPr>
       <w:r>
         <w:t xml:space="preserve">B. Budget cuts reducing testing time</w:t>
       </w:r>
-      <w:r>
-        <w:t xml:space="preserve"> </w:t>
-      </w:r>
+    </w:p>
+    <w:p>
+      <w:pPr>
+        <w:pStyle w:val="BodyText"/>
+      </w:pPr>
       <w:r>
         <w:t xml:space="preserve">C. The search function may return incorrect results for special characters</w:t>
       </w:r>
-      <w:r>
-        <w:t xml:space="preserve"> </w:t>
-      </w:r>
+    </w:p>
+    <w:p>
+      <w:pPr>
+        <w:pStyle w:val="BodyText"/>
+      </w:pPr>
       <w:r>
         <w:t xml:space="preserve">D. Key testers leaving the organization</w:t>
       </w:r>
@@ -1572,21 +1758,27 @@
       <w:r>
         <w:t xml:space="preserve">A. They are not tested at all</w:t>
       </w:r>
-      <w:r>
-        <w:t xml:space="preserve"> </w:t>
-      </w:r>
+    </w:p>
+    <w:p>
+      <w:pPr>
+        <w:pStyle w:val="BodyText"/>
+      </w:pPr>
       <w:r>
         <w:t xml:space="preserve">B. They receive less testing effort, with basic coverage</w:t>
       </w:r>
-      <w:r>
-        <w:t xml:space="preserve"> </w:t>
-      </w:r>
+    </w:p>
+    <w:p>
+      <w:pPr>
+        <w:pStyle w:val="BodyText"/>
+      </w:pPr>
       <w:r>
         <w:t xml:space="preserve">C. They are tested first</w:t>
       </w:r>
-      <w:r>
-        <w:t xml:space="preserve"> </w:t>
-      </w:r>
+    </w:p>
+    <w:p>
+      <w:pPr>
+        <w:pStyle w:val="BodyText"/>
+      </w:pPr>
       <w:r>
         <w:t xml:space="preserve">D. They receive the most exhaustive testing</w:t>
       </w:r>
@@ -1616,21 +1808,27 @@
       <w:r>
         <w:t xml:space="preserve">A. The color of the office walls</w:t>
       </w:r>
-      <w:r>
-        <w:t xml:space="preserve"> </w:t>
-      </w:r>
+    </w:p>
+    <w:p>
+      <w:pPr>
+        <w:pStyle w:val="BodyText"/>
+      </w:pPr>
       <w:r>
         <w:t xml:space="preserve">B. Test execution rate (test cases executed per day)</w:t>
       </w:r>
-      <w:r>
-        <w:t xml:space="preserve"> </w:t>
-      </w:r>
+    </w:p>
+    <w:p>
+      <w:pPr>
+        <w:pStyle w:val="BodyText"/>
+      </w:pPr>
       <w:r>
         <w:t xml:space="preserve">C. Number of meetings attended</w:t>
       </w:r>
-      <w:r>
-        <w:t xml:space="preserve"> </w:t>
-      </w:r>
+    </w:p>
+    <w:p>
+      <w:pPr>
+        <w:pStyle w:val="BodyText"/>
+      </w:pPr>
       <w:r>
         <w:t xml:space="preserve">D. Developer salary</w:t>
       </w:r>
@@ -1660,21 +1858,27 @@
       <w:r>
         <w:t xml:space="preserve">A. To eliminate all defects automatically</w:t>
       </w:r>
-      <w:r>
-        <w:t xml:space="preserve"> </w:t>
-      </w:r>
+    </w:p>
+    <w:p>
+      <w:pPr>
+        <w:pStyle w:val="BodyText"/>
+      </w:pPr>
       <w:r>
         <w:t xml:space="preserve">B. To ensure all testware is version-controlled, traceable, and reproducible</w:t>
       </w:r>
-      <w:r>
-        <w:t xml:space="preserve"> </w:t>
-      </w:r>
+    </w:p>
+    <w:p>
+      <w:pPr>
+        <w:pStyle w:val="BodyText"/>
+      </w:pPr>
       <w:r>
         <w:t xml:space="preserve">C. To replace the test plan</w:t>
       </w:r>
-      <w:r>
-        <w:t xml:space="preserve"> </w:t>
-      </w:r>
+    </w:p>
+    <w:p>
+      <w:pPr>
+        <w:pStyle w:val="BodyText"/>
+      </w:pPr>
       <w:r>
         <w:t xml:space="preserve">D. To generate test data</w:t>
       </w:r>
@@ -1704,21 +1908,27 @@
       <w:r>
         <w:t xml:space="preserve">A. Only the defect title and nothing else</w:t>
       </w:r>
-      <w:r>
-        <w:t xml:space="preserve"> </w:t>
-      </w:r>
+    </w:p>
+    <w:p>
+      <w:pPr>
+        <w:pStyle w:val="BodyText"/>
+      </w:pPr>
       <w:r>
         <w:t xml:space="preserve">B. Steps to reproduce, expected result, actual result, severity, and environment information</w:t>
       </w:r>
-      <w:r>
-        <w:t xml:space="preserve"> </w:t>
-      </w:r>
+    </w:p>
+    <w:p>
+      <w:pPr>
+        <w:pStyle w:val="BodyText"/>
+      </w:pPr>
       <w:r>
         <w:t xml:space="preserve">C. Only the developer’s name</w:t>
       </w:r>
-      <w:r>
-        <w:t xml:space="preserve"> </w:t>
-      </w:r>
+    </w:p>
+    <w:p>
+      <w:pPr>
+        <w:pStyle w:val="BodyText"/>
+      </w:pPr>
       <w:r>
         <w:t xml:space="preserve">D. Only a screenshot</w:t>
       </w:r>
@@ -1748,21 +1958,27 @@
       <w:r>
         <w:t xml:space="preserve">A. They are identical concepts</w:t>
       </w:r>
-      <w:r>
-        <w:t xml:space="preserve"> </w:t>
-      </w:r>
+    </w:p>
+    <w:p>
+      <w:pPr>
+        <w:pStyle w:val="BodyText"/>
+      </w:pPr>
       <w:r>
         <w:t xml:space="preserve">B. Severity measures technical impact; priority measures business urgency for fixing</w:t>
       </w:r>
-      <w:r>
-        <w:t xml:space="preserve"> </w:t>
-      </w:r>
+    </w:p>
+    <w:p>
+      <w:pPr>
+        <w:pStyle w:val="BodyText"/>
+      </w:pPr>
       <w:r>
         <w:t xml:space="preserve">C. Severity is set by management; priority is set by testers</w:t>
       </w:r>
-      <w:r>
-        <w:t xml:space="preserve"> </w:t>
-      </w:r>
+    </w:p>
+    <w:p>
+      <w:pPr>
+        <w:pStyle w:val="BodyText"/>
+      </w:pPr>
       <w:r>
         <w:t xml:space="preserve">D. Both are always the same value for any defect</w:t>
       </w:r>
@@ -1792,21 +2008,27 @@
       <w:r>
         <w:t xml:space="preserve">A. Performance testing tool</w:t>
       </w:r>
-      <w:r>
-        <w:t xml:space="preserve"> </w:t>
-      </w:r>
+    </w:p>
+    <w:p>
+      <w:pPr>
+        <w:pStyle w:val="BodyText"/>
+      </w:pPr>
       <w:r>
         <w:t xml:space="preserve">B. Static analysis tool</w:t>
       </w:r>
-      <w:r>
-        <w:t xml:space="preserve"> </w:t>
-      </w:r>
+    </w:p>
+    <w:p>
+      <w:pPr>
+        <w:pStyle w:val="BodyText"/>
+      </w:pPr>
       <w:r>
         <w:t xml:space="preserve">C. Test execution tool</w:t>
       </w:r>
-      <w:r>
-        <w:t xml:space="preserve"> </w:t>
-      </w:r>
+    </w:p>
+    <w:p>
+      <w:pPr>
+        <w:pStyle w:val="BodyText"/>
+      </w:pPr>
       <w:r>
         <w:t xml:space="preserve">D. Test management tool</w:t>
       </w:r>
@@ -1836,21 +2058,27 @@
       <w:r>
         <w:t xml:space="preserve">A. It eliminates the need for testers</w:t>
       </w:r>
-      <w:r>
-        <w:t xml:space="preserve"> </w:t>
-      </w:r>
+    </w:p>
+    <w:p>
+      <w:pPr>
+        <w:pStyle w:val="BodyText"/>
+      </w:pPr>
       <w:r>
         <w:t xml:space="preserve">B. It guarantees finding all defects</w:t>
       </w:r>
-      <w:r>
-        <w:t xml:space="preserve"> </w:t>
-      </w:r>
+    </w:p>
+    <w:p>
+      <w:pPr>
+        <w:pStyle w:val="BodyText"/>
+      </w:pPr>
       <w:r>
         <w:t xml:space="preserve">C. It provides faster regression feedback and consistent, repeatable test execution</w:t>
       </w:r>
-      <w:r>
-        <w:t xml:space="preserve"> </w:t>
-      </w:r>
+    </w:p>
+    <w:p>
+      <w:pPr>
+        <w:pStyle w:val="BodyText"/>
+      </w:pPr>
       <w:r>
         <w:t xml:space="preserve">D. It is always cheaper than manual testing</w:t>
       </w:r>
@@ -1880,21 +2108,27 @@
       <w:r>
         <w:t xml:space="preserve">A. Tests run faster than manual execution</w:t>
       </w:r>
-      <w:r>
-        <w:t xml:space="preserve"> </w:t>
-      </w:r>
+    </w:p>
+    <w:p>
+      <w:pPr>
+        <w:pStyle w:val="BodyText"/>
+      </w:pPr>
       <w:r>
         <w:t xml:space="preserve">B. Tests are executed consistently</w:t>
       </w:r>
-      <w:r>
-        <w:t xml:space="preserve"> </w:t>
-      </w:r>
+    </w:p>
+    <w:p>
+      <w:pPr>
+        <w:pStyle w:val="BodyText"/>
+      </w:pPr>
       <w:r>
         <w:t xml:space="preserve">C. High maintenance cost when the application frequently changes</w:t>
       </w:r>
-      <w:r>
-        <w:t xml:space="preserve"> </w:t>
-      </w:r>
+    </w:p>
+    <w:p>
+      <w:pPr>
+        <w:pStyle w:val="BodyText"/>
+      </w:pPr>
       <w:r>
         <w:t xml:space="preserve">D. Tests can run overnight</w:t>
       </w:r>
@@ -1924,21 +2158,27 @@
       <w:r>
         <w:t xml:space="preserve">A. Regression testing</w:t>
       </w:r>
-      <w:r>
-        <w:t xml:space="preserve"> </w:t>
-      </w:r>
+    </w:p>
+    <w:p>
+      <w:pPr>
+        <w:pStyle w:val="BodyText"/>
+      </w:pPr>
       <w:r>
         <w:t xml:space="preserve">B. Smoke testing</w:t>
       </w:r>
-      <w:r>
-        <w:t xml:space="preserve"> </w:t>
-      </w:r>
+    </w:p>
+    <w:p>
+      <w:pPr>
+        <w:pStyle w:val="BodyText"/>
+      </w:pPr>
       <w:r>
         <w:t xml:space="preserve">C. Exploratory testing requiring human creativity and judgment</w:t>
       </w:r>
-      <w:r>
-        <w:t xml:space="preserve"> </w:t>
-      </w:r>
+    </w:p>
+    <w:p>
+      <w:pPr>
+        <w:pStyle w:val="BodyText"/>
+      </w:pPr>
       <w:r>
         <w:t xml:space="preserve">D. Data-driven testing with thousands of inputs</w:t>
       </w:r>

</xml_diff>